<commit_message>
updated links in reports
</commit_message>
<xml_diff>
--- a/Agriculture-Production-Prediction/AgriculturePrecictionSystem_Saismith_USC_UTC.docx
+++ b/Agriculture-Production-Prediction/AgriculturePrecictionSystem_Saismith_USC_UTC.docx
@@ -168,7 +168,15 @@
               <w:t xml:space="preserve">report </w:t>
             </w:r>
             <w:r>
-              <w:t>provides details of the Industrial Internship provided by upskill Campus and The IoT Academy in collaboration with Industrial Partner UniConverge Technologies Pvt Ltd (UCT).</w:t>
+              <w:t xml:space="preserve">provides details of the Industrial Internship provided by upskill Campus and The IoT Academy in collaboration with Industrial Partner </w:t>
+            </w:r>
+            <w:proofErr w:type="spellStart"/>
+            <w:r>
+              <w:t>UniConverge</w:t>
+            </w:r>
+            <w:proofErr w:type="spellEnd"/>
+            <w:r>
+              <w:t xml:space="preserve"> Technologies Pvt Ltd (UCT).</w:t>
             </w:r>
           </w:p>
           <w:p>
@@ -187,7 +195,15 @@
               <w:t xml:space="preserve">My project was </w:t>
             </w:r>
             <w:r>
-              <w:t>(Tell about ur Project)</w:t>
+              <w:t xml:space="preserve">(Tell about </w:t>
+            </w:r>
+            <w:proofErr w:type="spellStart"/>
+            <w:r>
+              <w:t>ur</w:t>
+            </w:r>
+            <w:proofErr w:type="spellEnd"/>
+            <w:r>
+              <w:t xml:space="preserve"> Project)</w:t>
             </w:r>
           </w:p>
           <w:p>
@@ -1954,8 +1970,13 @@
       </w:r>
     </w:p>
     <w:p>
-      <w:r>
-        <w:t xml:space="preserve">Thank to all (with names), who have helped you directly or indirectly. </w:t>
+      <w:proofErr w:type="spellStart"/>
+      <w:r>
+        <w:t>Thank</w:t>
+      </w:r>
+      <w:proofErr w:type="spellEnd"/>
+      <w:r>
+        <w:t xml:space="preserve"> to all (with names), who have helped you directly or indirectly. </w:t>
       </w:r>
     </w:p>
     <w:p>
@@ -2005,7 +2026,21 @@
         <w:rPr>
           <w:lang w:val="en-US"/>
         </w:rPr>
-        <w:t>About UniConverge Technologies Pvt Ltd</w:t>
+        <w:t xml:space="preserve">About </w:t>
+      </w:r>
+      <w:proofErr w:type="spellStart"/>
+      <w:r>
+        <w:rPr>
+          <w:lang w:val="en-US"/>
+        </w:rPr>
+        <w:t>UniConverge</w:t>
+      </w:r>
+      <w:proofErr w:type="spellEnd"/>
+      <w:r>
+        <w:rPr>
+          <w:lang w:val="en-US"/>
+        </w:rPr>
+        <w:t xml:space="preserve"> Technologies Pvt Ltd</w:t>
       </w:r>
       <w:bookmarkEnd w:id="3"/>
     </w:p>
@@ -2014,7 +2049,15 @@
         <w:t>A company established in 2013 and working i</w:t>
       </w:r>
       <w:r>
-        <w:t>n Digital Transformation domain and providing Industrial solutions with prime focus on sustainability and RoI.</w:t>
+        <w:t xml:space="preserve">n Digital Transformation domain and providing Industrial solutions with prime focus on sustainability and </w:t>
+      </w:r>
+      <w:proofErr w:type="spellStart"/>
+      <w:r>
+        <w:t>RoI</w:t>
+      </w:r>
+      <w:proofErr w:type="spellEnd"/>
+      <w:r>
+        <w:t>.</w:t>
       </w:r>
     </w:p>
     <w:p>
@@ -2026,7 +2069,23 @@
           <w:b/>
           <w:bCs/>
         </w:rPr>
-        <w:t> Cutting Edge Technologies e.g. Internet of Things (IoT), Cyber Security, Cloud computing (AWS, Azure), Machine Learning, Communication Technologies (4G/5G/LoRaWAN), Java Full Stack, Python, Front end </w:t>
+        <w:t> Cutting Edge Technologies e.g. Internet of Things (IoT), Cyber Security, Cloud computing (AWS, Azure), Machine Learning, Communication Technologies (4G/5G/</w:t>
+      </w:r>
+      <w:proofErr w:type="spellStart"/>
+      <w:r>
+        <w:rPr>
+          <w:b/>
+          <w:bCs/>
+        </w:rPr>
+        <w:t>LoRaWAN</w:t>
+      </w:r>
+      <w:proofErr w:type="spellEnd"/>
+      <w:r>
+        <w:rPr>
+          <w:b/>
+          <w:bCs/>
+        </w:rPr>
+        <w:t>), Java Full Stack, Python, Front end </w:t>
       </w:r>
       <w:r>
         <w:t>etc.</w:t>
@@ -2199,7 +2258,15 @@
         <w:t xml:space="preserve"> is an IOT platform designed for quick deployment of IOT applications on the same time providing valuable “insight” for your process/business.</w:t>
       </w:r>
       <w:r>
-        <w:t xml:space="preserve"> It has been built in Java for backend and ReactJS for Front end. It has support for MySQL and various NoSql Databases.</w:t>
+        <w:t xml:space="preserve"> It has been built in Java for backend and ReactJS for Front end. It has support for MySQL and various </w:t>
+      </w:r>
+      <w:proofErr w:type="spellStart"/>
+      <w:r>
+        <w:t>NoSql</w:t>
+      </w:r>
+      <w:proofErr w:type="spellEnd"/>
+      <w:r>
+        <w:t xml:space="preserve"> Databases.</w:t>
       </w:r>
     </w:p>
     <w:p>
@@ -2243,7 +2310,15 @@
       </w:r>
       <w:r>
         <w:br/>
-        <w:t>• Integration with third party application(Power BI, SAP, ERP)</w:t>
+        <w:t xml:space="preserve">• Integration with third party </w:t>
+      </w:r>
+      <w:proofErr w:type="gramStart"/>
+      <w:r>
+        <w:t>application(</w:t>
+      </w:r>
+      <w:proofErr w:type="gramEnd"/>
+      <w:r>
+        <w:t>Power BI, SAP, ERP)</w:t>
       </w:r>
       <w:r>
         <w:br/>
@@ -2732,6 +2807,7 @@
       </w:r>
     </w:p>
     <w:p>
+      <w:proofErr w:type="gramStart"/>
       <w:r>
         <w:t>U</w:t>
       </w:r>
@@ -2739,13 +2815,41 @@
         <w:t xml:space="preserve">CT </w:t>
       </w:r>
       <w:r>
-        <w:t xml:space="preserve"> is one of the early adopter</w:t>
+        <w:t xml:space="preserve"> is</w:t>
+      </w:r>
+      <w:proofErr w:type="gramEnd"/>
+      <w:r>
+        <w:t xml:space="preserve"> one of the early adopter</w:t>
       </w:r>
       <w:r>
         <w:t>s</w:t>
       </w:r>
       <w:r>
-        <w:t xml:space="preserve"> of LoRAWAN teschnology and providing solution in Agritech, Smart cities, Industrial Monitoring, Smart Street Light, Smart Water/ Gas/ Electricity metering solutions etc.</w:t>
+        <w:t xml:space="preserve"> of </w:t>
+      </w:r>
+      <w:proofErr w:type="spellStart"/>
+      <w:r>
+        <w:t>LoRAWAN</w:t>
+      </w:r>
+      <w:proofErr w:type="spellEnd"/>
+      <w:r>
+        <w:t xml:space="preserve"> </w:t>
+      </w:r>
+      <w:proofErr w:type="spellStart"/>
+      <w:r>
+        <w:t>teschnology</w:t>
+      </w:r>
+      <w:proofErr w:type="spellEnd"/>
+      <w:r>
+        <w:t xml:space="preserve"> and providing solution in </w:t>
+      </w:r>
+      <w:proofErr w:type="spellStart"/>
+      <w:r>
+        <w:t>Agritech</w:t>
+      </w:r>
+      <w:proofErr w:type="spellEnd"/>
+      <w:r>
+        <w:t>, Smart cities, Industrial Monitoring, Smart Street Light, Smart Water/ Gas/ Electricity metering solutions etc.</w:t>
       </w:r>
     </w:p>
     <w:p>
@@ -2865,7 +2969,23 @@
           <w:rFonts w:ascii="Arial" w:hAnsi="Arial"/>
           <w:kern w:val="24"/>
         </w:rPr>
-        <w:t>upskill Campus along with The IoT Academy and in association with Uniconverge technologies has facilitated the smooth execution of the complete internship</w:t>
+        <w:t xml:space="preserve">upskill Campus along with The IoT Academy and in association with </w:t>
+      </w:r>
+      <w:proofErr w:type="spellStart"/>
+      <w:r>
+        <w:rPr>
+          <w:rFonts w:ascii="Arial" w:hAnsi="Arial"/>
+          <w:kern w:val="24"/>
+        </w:rPr>
+        <w:t>Uniconverge</w:t>
+      </w:r>
+      <w:proofErr w:type="spellEnd"/>
+      <w:r>
+        <w:rPr>
+          <w:rFonts w:ascii="Arial" w:hAnsi="Arial"/>
+          <w:kern w:val="24"/>
+        </w:rPr>
+        <w:t xml:space="preserve"> technologies has facilitated the smooth execution of the complete internship</w:t>
       </w:r>
       <w:r>
         <w:rPr>
@@ -3603,7 +3723,29 @@
                                 <w:sz w:val="30"/>
                                 <w:szCs w:val="30"/>
                               </w:rPr>
-                              <w:t>Seeing need of upskilling in self paced manner along-with additional support services e.g. Internship, projects, interaction with Industry experts, Career growth Services</w:t>
+                              <w:t xml:space="preserve">Seeing need of upskilling in </w:t>
+                            </w:r>
+                            <w:proofErr w:type="spellStart"/>
+                            <w:r>
+                              <w:rPr>
+                                <w:rFonts w:asciiTheme="minorHAnsi" w:hAnsi="Calibri" w:cstheme="minorBidi"/>
+                                <w:color w:val="000000" w:themeColor="text1"/>
+                                <w:kern w:val="24"/>
+                                <w:sz w:val="30"/>
+                                <w:szCs w:val="30"/>
+                              </w:rPr>
+                              <w:t>self paced</w:t>
+                            </w:r>
+                            <w:proofErr w:type="spellEnd"/>
+                            <w:r>
+                              <w:rPr>
+                                <w:rFonts w:asciiTheme="minorHAnsi" w:hAnsi="Calibri" w:cstheme="minorBidi"/>
+                                <w:color w:val="000000" w:themeColor="text1"/>
+                                <w:kern w:val="24"/>
+                                <w:sz w:val="30"/>
+                                <w:szCs w:val="30"/>
+                              </w:rPr>
+                              <w:t xml:space="preserve"> manner along-with additional support services e.g. Internship, projects, interaction with Industry experts, Career growth Services</w:t>
                             </w:r>
                           </w:p>
                         </w:txbxContent>
@@ -3645,7 +3787,29 @@
                           <w:sz w:val="30"/>
                           <w:szCs w:val="30"/>
                         </w:rPr>
-                        <w:t>Seeing need of upskilling in self paced manner along-with additional support services e.g. Internship, projects, interaction with Industry experts, Career growth Services</w:t>
+                        <w:t xml:space="preserve">Seeing need of upskilling in </w:t>
+                      </w:r>
+                      <w:proofErr w:type="spellStart"/>
+                      <w:r>
+                        <w:rPr>
+                          <w:rFonts w:asciiTheme="minorHAnsi" w:hAnsi="Calibri" w:cstheme="minorBidi"/>
+                          <w:color w:val="000000" w:themeColor="text1"/>
+                          <w:kern w:val="24"/>
+                          <w:sz w:val="30"/>
+                          <w:szCs w:val="30"/>
+                        </w:rPr>
+                        <w:t>self paced</w:t>
+                      </w:r>
+                      <w:proofErr w:type="spellEnd"/>
+                      <w:r>
+                        <w:rPr>
+                          <w:rFonts w:asciiTheme="minorHAnsi" w:hAnsi="Calibri" w:cstheme="minorBidi"/>
+                          <w:color w:val="000000" w:themeColor="text1"/>
+                          <w:kern w:val="24"/>
+                          <w:sz w:val="30"/>
+                          <w:szCs w:val="30"/>
+                        </w:rPr>
+                        <w:t xml:space="preserve"> manner along-with additional support services e.g. Internship, projects, interaction with Industry experts, Career growth Services</w:t>
                       </w:r>
                     </w:p>
                   </w:txbxContent>
@@ -4151,6 +4315,7 @@
                               <w:pStyle w:val="NormalWeb"/>
                               <w:spacing w:before="0" w:beforeAutospacing="0" w:after="0" w:afterAutospacing="0"/>
                             </w:pPr>
+                            <w:proofErr w:type="spellStart"/>
                             <w:r>
                               <w:rPr>
                                 <w:rFonts w:asciiTheme="minorHAnsi" w:hAnsi="Calibri" w:cstheme="minorBidi"/>
@@ -4159,7 +4324,18 @@
                                 <w:sz w:val="30"/>
                                 <w:szCs w:val="30"/>
                               </w:rPr>
-                              <w:t>upSkill Campus aiming to upskill 1 million learners in next 5 year</w:t>
+                              <w:t>upSkill</w:t>
+                            </w:r>
+                            <w:proofErr w:type="spellEnd"/>
+                            <w:r>
+                              <w:rPr>
+                                <w:rFonts w:asciiTheme="minorHAnsi" w:hAnsi="Calibri" w:cstheme="minorBidi"/>
+                                <w:color w:val="000000" w:themeColor="text1"/>
+                                <w:kern w:val="24"/>
+                                <w:sz w:val="30"/>
+                                <w:szCs w:val="30"/>
+                              </w:rPr>
+                              <w:t xml:space="preserve"> Campus aiming to upskill 1 million learners in next 5 year</w:t>
                             </w:r>
                           </w:p>
                         </w:txbxContent>
@@ -4189,6 +4365,7 @@
                         <w:pStyle w:val="NormalWeb"/>
                         <w:spacing w:before="0" w:beforeAutospacing="0" w:after="0" w:afterAutospacing="0"/>
                       </w:pPr>
+                      <w:proofErr w:type="spellStart"/>
                       <w:r>
                         <w:rPr>
                           <w:rFonts w:asciiTheme="minorHAnsi" w:hAnsi="Calibri" w:cstheme="minorBidi"/>
@@ -4197,7 +4374,18 @@
                           <w:sz w:val="30"/>
                           <w:szCs w:val="30"/>
                         </w:rPr>
-                        <w:t>upSkill Campus aiming to upskill 1 million learners in next 5 year</w:t>
+                        <w:t>upSkill</w:t>
+                      </w:r>
+                      <w:proofErr w:type="spellEnd"/>
+                      <w:r>
+                        <w:rPr>
+                          <w:rFonts w:asciiTheme="minorHAnsi" w:hAnsi="Calibri" w:cstheme="minorBidi"/>
+                          <w:color w:val="000000" w:themeColor="text1"/>
+                          <w:kern w:val="24"/>
+                          <w:sz w:val="30"/>
+                          <w:szCs w:val="30"/>
+                        </w:rPr>
+                        <w:t xml:space="preserve"> Campus aiming to upskill 1 million learners in next 5 year</w:t>
                       </w:r>
                     </w:p>
                   </w:txbxContent>
@@ -4978,7 +5166,18 @@
         <w:pStyle w:val="Heading2"/>
       </w:pPr>
       <w:r>
-        <w:t>Code submission (Github link)</w:t>
+        <w:t>Code submission (</w:t>
+      </w:r>
+      <w:proofErr w:type="spellStart"/>
+      <w:r>
+        <w:t>Github</w:t>
+      </w:r>
+      <w:proofErr w:type="spellEnd"/>
+      <w:r>
+        <w:t xml:space="preserve"> link)</w:t>
+      </w:r>
+      <w:r>
+        <w:t>:</w:t>
       </w:r>
     </w:p>
     <w:p>
@@ -4991,8 +5190,29 @@
         <w:rPr>
           <w:lang w:val="en-GB"/>
         </w:rPr>
-        <w:t>Project4_Ag_Prediction of Agriculture Crop Production In India/AgriculturePrecdictionSystem.py</w:t>
-      </w:r>
+        <w:t>Agriculture-Production-Prediction/AgriculturePrecdictionSystem.py</w:t>
+      </w:r>
+    </w:p>
+    <w:p>
+      <w:pPr>
+        <w:pStyle w:val="Heading2"/>
+      </w:pPr>
+      <w:r>
+        <w:t>Report submission (</w:t>
+      </w:r>
+      <w:proofErr w:type="spellStart"/>
+      <w:r>
+        <w:t>Github</w:t>
+      </w:r>
+      <w:proofErr w:type="spellEnd"/>
+      <w:r>
+        <w:t xml:space="preserve"> </w:t>
+      </w:r>
+      <w:proofErr w:type="gramStart"/>
+      <w:r>
+        <w:t>link)  :</w:t>
+      </w:r>
+      <w:proofErr w:type="gramEnd"/>
     </w:p>
     <w:p>
       <w:pPr>
@@ -5000,19 +5220,11 @@
           <w:lang w:val="en-GB"/>
         </w:rPr>
       </w:pPr>
-    </w:p>
-    <w:p>
-      <w:pPr>
-        <w:pStyle w:val="Heading2"/>
-      </w:pPr>
-      <w:r>
-        <w:t xml:space="preserve">Report submission (Github link)  : </w:t>
-      </w:r>
       <w:r>
         <w:rPr>
-          <w:b w:val="0"/>
+          <w:lang w:val="en-GB"/>
         </w:rPr>
-        <w:t>placeholder</w:t>
+        <w:t>Agriculture-Production-Prediction/AgriculturePrecictionSystem_Saismith_USC_UTC.docx</w:t>
       </w:r>
     </w:p>
     <w:p>
@@ -5051,7 +5263,15 @@
     <w:p/>
     <w:p>
       <w:r>
-        <w:t>Given more details about design flow of your solution. This is applicable for all domains. DS/ML Students can cover it after they have their algorithm implementation. There is always a start, intermediate stages and then final outcome.</w:t>
+        <w:t xml:space="preserve">Given more details about design flow of your solution. This is applicable for all domains. DS/ML Students can cover it after they have their algorithm implementation. There </w:t>
+      </w:r>
+      <w:proofErr w:type="gramStart"/>
+      <w:r>
+        <w:t>is</w:t>
+      </w:r>
+      <w:proofErr w:type="gramEnd"/>
+      <w:r>
+        <w:t xml:space="preserve"> always a start, intermediate stages and then final outcome.</w:t>
       </w:r>
     </w:p>
     <w:p>
@@ -5178,7 +5398,23 @@
     <w:p/>
     <w:p>
       <w:r>
-        <w:t>The system follows the following workflow: Agricultural Dataset Collection ↓ Data Cleaning and Preprocessing ↓ Feature Selection and Encoding ↓ Train-Test Split ↓ Machine Learning Model Training ↓ Model Evaluation ↓ Prediction and Analysis 5.1 High Level Diagram (if applicable) Agricultural Data | v Data Preprocessing | Industrial Internship Report Page 15 Industrial Internship Report Page 16 v Feature Engineering | v Machine Learning Models | +----------------+ | | v v Crop Production Crop Yield Prediction Prediction | v Results &amp; Analysis</w:t>
+        <w:t xml:space="preserve">The system follows the following workflow: Agricultural Dataset Collection ↓ Data Cleaning and Preprocessing ↓ Feature Selection and Encoding ↓ Train-Test Split ↓ Machine Learning Model Training ↓ Model Evaluation ↓ Prediction and Analysis 5.1 High Level Diagram (if applicable) Agricultural Data | v Data Preprocessing | Industrial Internship Report Page 15 Industrial Internship Report Page 16 v Feature Engineering | v Machine Learning Models | +----------------+ | | v </w:t>
+      </w:r>
+      <w:proofErr w:type="spellStart"/>
+      <w:r>
+        <w:t>v</w:t>
+      </w:r>
+      <w:proofErr w:type="spellEnd"/>
+      <w:r>
+        <w:t xml:space="preserve"> Crop Production Crop Yield Prediction </w:t>
+      </w:r>
+      <w:proofErr w:type="spellStart"/>
+      <w:r>
+        <w:t>Prediction</w:t>
+      </w:r>
+      <w:proofErr w:type="spellEnd"/>
+      <w:r>
+        <w:t xml:space="preserve"> | v Results &amp; Analysis</w:t>
       </w:r>
     </w:p>
     <w:p/>
@@ -5398,7 +5634,15 @@
     </w:p>
     <w:p>
       <w:r>
-        <w:t>Best Model: Random Forest Regressor The Random Forest model provided the highest prediction accuracy for both modules.</w:t>
+        <w:t xml:space="preserve">Best Model: Random Forest Regressor </w:t>
+      </w:r>
+      <w:proofErr w:type="gramStart"/>
+      <w:r>
+        <w:t>The</w:t>
+      </w:r>
+      <w:proofErr w:type="gramEnd"/>
+      <w:r>
+        <w:t xml:space="preserve"> Random Forest model provided the highest prediction accuracy for both modules.</w:t>
       </w:r>
     </w:p>
     <w:p>
@@ -5579,7 +5823,15 @@
         <w:spacing w:after="0" w:line="240" w:lineRule="auto"/>
       </w:pPr>
       <w:r>
-        <w:t xml:space="preserve">Advanced machine learning techniques such as XGBoost, Deep Learning, and real-time agricultural monitoring systems can also be implemented to improve prediction accuracy and system performance. </w:t>
+        <w:t xml:space="preserve">Advanced machine learning techniques such as </w:t>
+      </w:r>
+      <w:proofErr w:type="spellStart"/>
+      <w:r>
+        <w:t>XGBoost</w:t>
+      </w:r>
+      <w:proofErr w:type="spellEnd"/>
+      <w:r>
+        <w:t xml:space="preserve">, Deep Learning, and real-time agricultural monitoring systems can also be implemented to improve prediction accuracy and system performance. </w:t>
       </w:r>
       <w:r>
         <w:rPr>
@@ -9723,6 +9975,7 @@
   <w:style w:type="character" w:default="1" w:styleId="DefaultParagraphFont">
     <w:name w:val="Default Paragraph Font"/>
     <w:uiPriority w:val="1"/>
+    <w:semiHidden/>
     <w:unhideWhenUsed/>
   </w:style>
   <w:style w:type="table" w:default="1" w:styleId="TableNormal">

</xml_diff>